<commit_message>
Refine essay: facilities-engineer framing, smoothed conclusion, 5-source APA refs
</commit_message>
<xml_diff>
--- a/Week 3/ALY3510_MatthewNaughton_Week3_Fall_2026.docx
+++ b/Week 3/ALY3510_MatthewNaughton_Week3_Fall_2026.docx
@@ -13,7 +13,7 @@
         <w:rPr>
           <w:b/>
         </w:rPr>
-        <w:t>Reasoning in Diagnosis: Abductive, Deductive, and Predictive Thinking</w:t>
+        <w:t>Reasoning in Medical Diagnosis: How Doctors Use Logic to Reach a Diagnosis</w:t>
       </w:r>
     </w:p>
     <w:p/>
@@ -85,7 +85,7 @@
         <w:rPr>
           <w:b/>
         </w:rPr>
-        <w:t>Reasoning in Diagnosis: Abductive, Deductive, and Predictive Thinking</w:t>
+        <w:t>Reasoning in Medical Diagnosis: How Doctors Use Logic to Reach a Diagnosis</w:t>
       </w:r>
     </w:p>
     <w:p>
@@ -108,7 +108,7 @@
         <w:rPr>
           <w:b w:val="0"/>
         </w:rPr>
-        <w:t>Of the scenarios provided for this assignment, I chose the doctor diagnosing a patient because it is the closest comparison to the kind of troubleshooting I do every day. As a facilities engineer, a large part of my job involves figuring out why systems are not behaving the way they should, whether that is a plumbing system, a pump, commercial kitchen equipment, or a fire protection system. The more I thought about the diagnostic process, the more familiar it felt. In both cases, you start with symptoms, work through possible causes, test your assumptions, and decide on a course of action.</w:t>
+        <w:t>A medical diagnosis rarely comes down to a single test result. A physician usually has to interpret incomplete information, weigh several competing explanations, and make decisions before all the evidence is in. I recognize that situation because I do a version of it every day. As a facilities engineer, I troubleshoot plumbing systems, pumps, commercial kitchen equipment, and fire protection systems, and my process is consistent: I observe the symptoms, recall similar problems I have seen before, settle on the most likely cause, predict what will happen if it goes unaddressed, and then verify that cause before I commit to a repair. A doctor works through nearly the same sequence with a patient. Looking at the diagnostic process through a troubleshooter's eyes makes the underlying reasoning easier to see.</w:t>
       </w:r>
     </w:p>
     <w:p>
@@ -120,7 +120,7 @@
         <w:rPr>
           <w:b w:val="0"/>
         </w:rPr>
-        <w:t>What interested me most was how closely that process aligns with several formal types of reasoning. In this paper, I focus on abductive, deductive, and predictive reasoning because they seem to form the core of how both doctors and troubleshooters work through problems. Rather than acting as separate steps, they work together as part of a cycle that moves someone from a set of symptoms to a reasoned and verified conclusion.</w:t>
+        <w:t>This paper examines how a physician reasons through the diagnostic process, using the scenario of a doctor diagnosing a patient. It focuses on abductive, deductive, and predictive reasoning, with a shorter look at the supporting roles of inductive and analogical reasoning. Each of these moves the physician a step closer to identifying a condition and deciding how to treat it.</w:t>
       </w:r>
     </w:p>
     <w:p>
@@ -131,7 +131,7 @@
         <w:rPr>
           <w:b/>
         </w:rPr>
-        <w:t>Abductive Reasoning: Forming the Best Explanation</w:t>
+        <w:t>Abductive Reasoning: Identifying the Most Likely Explanation</w:t>
       </w:r>
     </w:p>
     <w:p>
@@ -143,7 +143,7 @@
         <w:rPr>
           <w:b w:val="0"/>
         </w:rPr>
-        <w:t>The first step in diagnosis is usually abductive reasoning. Abduction starts with a set of observations and works toward the explanation that best fits the available evidence. According to Sooknanan and Seemungal (2019), clinicians rely on abductive reasoning when they move from a patient's symptoms toward a possible diagnosis because they are often working with incomplete information.</w:t>
+        <w:t>Abductive reasoning starts with a set of observations and looks for the explanation that best accounts for them. It does not prove a conclusion; it produces the most plausible hypothesis from limited information and stays open to being wrong. Sooknanan and Seemungal (2019) describe diagnosis as a process built on incomplete and shifting information, and they place abduction at the front of that process, where the clinician turns symptoms into candidate explanations.</w:t>
       </w:r>
     </w:p>
     <w:p>
@@ -155,7 +155,7 @@
         <w:rPr>
           <w:b w:val="0"/>
         </w:rPr>
-        <w:t>Imagine a patient arrives with fatigue, excessive thirst, and frequent urination. None of those symptoms alone point directly to a diagnosis, but together they suggest a possible explanation such as diabetes. At this point, the doctor is not proving anything. The goal is simply to identify the most likely cause based on the available information.</w:t>
+        <w:t>Abduction is usually the doctor's first move. A patient arrives with fever, cough, fatigue, and shortness of breath. None of those symptoms names a disease on its own, so the physician assembles a short list of explanations that could produce the whole picture: influenza, pneumonia, COVID-19, or another respiratory infection. The question driving this stage is simple: what condition would explain everything I am seeing?</w:t>
       </w:r>
     </w:p>
     <w:p>
@@ -167,7 +167,7 @@
         <w:rPr>
           <w:b w:val="0"/>
         </w:rPr>
-        <w:t>I find myself doing the same thing when troubleshooting equipment. If a dishwasher is struggling to reach temperature, I may notice a slow heat rise, evidence of scaling, and an intermittent heating element issue. None of those observations proves the cause, but together they point toward the most likely explanation. Abductive reasoning is what gets both the doctor and the troubleshooter from “something isn't right” to “this is probably what's going on.”</w:t>
+        <w:t>I use the same instinct when I approach a piece of equipment failing in an unfamiliar way. When a commercial dishwasher stops reaching sanitizing temperature, I do not have proof of the cause, but a slow heat rise, a nuisance-tripping element, and the heavy scale buildup I have run into before point me toward a most-likely explanation. Like the physician, I hold that explanation loosely. If the next thing I check does not fit, I revise it. Abduction gets both of us from “something is clearly wrong” to a working theory worth testing.</w:t>
       </w:r>
     </w:p>
     <w:p>
@@ -178,7 +178,7 @@
         <w:rPr>
           <w:b/>
         </w:rPr>
-        <w:t>Deductive Reasoning: Testing the Explanation</w:t>
+        <w:t>Deductive Reasoning: Testing Diagnostic Hypotheses</w:t>
       </w:r>
     </w:p>
     <w:p>
@@ -190,7 +190,7 @@
         <w:rPr>
           <w:b w:val="0"/>
         </w:rPr>
-        <w:t>Once a likely explanation exists, the next question is whether it actually holds up. This is where deductive reasoning becomes important. Deductive reasoning starts with a known rule and applies it to a specific situation. If the premises are true and the reasoning is valid, the conclusion follows logically (Shanahan, n.d.).</w:t>
+        <w:t>Once a leading explanation exists, the reasoning changes direction. Deductive reasoning starts from a general rule and applies it to a specific case, and when the premises hold and the logic is valid, the conclusion follows necessarily. Shanahan (n.d.) draws exactly this line between deduction, whose conclusions are meant to follow with certainty, and weaker forms of reasoning that make a conclusion only probable.</w:t>
       </w:r>
     </w:p>
     <w:p>
@@ -202,7 +202,46 @@
         <w:rPr>
           <w:b w:val="0"/>
         </w:rPr>
-        <w:t>In medicine, deduction is often used to determine what evidence should exist if a diagnosis is correct. Sooknanan and Seemungal (2019) describe this stage as the process of determining what tests should be performed to confirm or reject a hypothesis.</w:t>
+        <w:t>A physician uses deduction to spell out what should be true if a hypothesis is correct, then checks for it. If the working diagnosis is bacterial pneumonia, specific findings should appear on imaging, in lab work, or on physical examination. The reasoning takes a familiar form:</w:t>
+      </w:r>
+    </w:p>
+    <w:p>
+      <w:pPr>
+        <w:pStyle w:val="ListBullet"/>
+        <w:spacing w:line="480" w:lineRule="auto" w:after="0" w:before="0"/>
+      </w:pPr>
+      <w:r>
+        <w:rPr>
+          <w:rFonts w:ascii="Times New Roman" w:hAnsi="Times New Roman"/>
+          <w:sz w:val="24"/>
+        </w:rPr>
+        <w:t>Patients with bacterial pneumonia usually show infiltrates on a chest X-ray.</w:t>
+      </w:r>
+    </w:p>
+    <w:p>
+      <w:pPr>
+        <w:pStyle w:val="ListBullet"/>
+        <w:spacing w:line="480" w:lineRule="auto" w:after="0" w:before="0"/>
+      </w:pPr>
+      <w:r>
+        <w:rPr>
+          <w:rFonts w:ascii="Times New Roman" w:hAnsi="Times New Roman"/>
+          <w:sz w:val="24"/>
+        </w:rPr>
+        <w:t>This patient may have bacterial pneumonia.</w:t>
+      </w:r>
+    </w:p>
+    <w:p>
+      <w:pPr>
+        <w:pStyle w:val="ListBullet"/>
+        <w:spacing w:line="480" w:lineRule="auto" w:after="0" w:before="0"/>
+      </w:pPr>
+      <w:r>
+        <w:rPr>
+          <w:rFonts w:ascii="Times New Roman" w:hAnsi="Times New Roman"/>
+          <w:sz w:val="24"/>
+        </w:rPr>
+        <w:t>A chest X-ray should therefore show infiltrates.</w:t>
       </w:r>
     </w:p>
     <w:p>
@@ -214,7 +253,18 @@
         <w:rPr>
           <w:b w:val="0"/>
         </w:rPr>
-        <w:t>For example, if a doctor suspects diabetes, they can order a blood glucose test. If the results meet the established diagnostic criteria, the diagnosis gains strong support. The physician is no longer relying only on a plausible explanation but on evidence tied to established medical standards.</w:t>
+        <w:t>If the film is clear, the premise fails and the hypothesis is in trouble, which sends the physician back to the list of explanations. I run the same kind of check before I trust a repair. I work from rules I know hold for a system: if I close an isolation valve, downstream pressure should drop to zero. I close the valve, watch the gauge, and the result either confirms my theory or rules it out. Ordering a test and closing a valve are the same act of reasoning: deriving a specific, checkable consequence from a general rule and letting the result decide.</w:t>
+      </w:r>
+    </w:p>
+    <w:p>
+      <w:pPr>
+        <w:jc w:val="center"/>
+      </w:pPr>
+      <w:r>
+        <w:rPr>
+          <w:b/>
+        </w:rPr>
+        <w:t>Predictive Reasoning: Anticipating Future Outcomes</w:t>
       </w:r>
     </w:p>
     <w:p>
@@ -226,18 +276,7 @@
         <w:rPr>
           <w:b w:val="0"/>
         </w:rPr>
-        <w:t>The same process exists in troubleshooting. I often work from simple rules about how a system should behave. If a closed valve should eliminate downstream pressure, then the pressure gauge provides an objective way to test my hypothesis. The result either supports my explanation or sends me back to look for another one. Deduction is what allows both doctors and troubleshooters to move beyond educated guesses and start verifying their conclusions.</w:t>
-      </w:r>
-    </w:p>
-    <w:p>
-      <w:pPr>
-        <w:jc w:val="center"/>
-      </w:pPr>
-      <w:r>
-        <w:rPr>
-          <w:b/>
-        </w:rPr>
-        <w:t>Predictive Reasoning: Looking Ahead</w:t>
+        <w:t>Diagnosing the problem is only part of the job. A physician also has to anticipate what comes next, both if the condition is treated and if it is left alone. Predictive reasoning uses the current picture to forecast outcomes, risks, and responses to treatment. Accad (2009) points out that predicting the course of an illness has always been one of medicine's central tasks, though he also warns that clinicians can put too much faith in predictive tools and forget that a prediction is a probability, not a promise.</w:t>
       </w:r>
     </w:p>
     <w:p>
@@ -249,7 +288,7 @@
         <w:rPr>
           <w:b w:val="0"/>
         </w:rPr>
-        <w:t>Diagnosis is not only about understanding what is happening now. It is also about understanding what is likely to happen next. Predictive reasoning uses current information to forecast future outcomes, whether those outcomes are good or bad.</w:t>
+        <w:t>The forecasts a physician makes shape what happens next. If a patient's oxygen levels keep falling while signs of infection climb, the doctor predicts a real risk of respiratory failure and acts before it arrives. The same reasoning supports the more routine prediction that a patient should improve on antibiotics, or that a worsening course will call for a higher level of care. These forecasts let the physician set priorities and explain the stakes to the patient and family.</w:t>
       </w:r>
     </w:p>
     <w:p>
@@ -261,7 +300,18 @@
         <w:rPr>
           <w:b w:val="0"/>
         </w:rPr>
-        <w:t>Accad (2009) notes that prediction has always been an important part of medicine because physicians are expected to estimate the likely course of a patient's condition. At the same time, he cautions that predictions are never guarantees and should be treated as probabilities rather than certainties.</w:t>
+        <w:t>Prediction is also what usually sets my repair priorities. When I find a slow leak behind a wall, the finding itself is minor; the prediction is what matters. Water damage, mold, and eventual structural or code problems are what turn that leak into an urgent work order. I have learned to treat those predictions the way Accad (2009) recommends clinicians treat theirs: as informed probabilities that guide action rather than guarantees.</w:t>
+      </w:r>
+    </w:p>
+    <w:p>
+      <w:pPr>
+        <w:jc w:val="center"/>
+      </w:pPr>
+      <w:r>
+        <w:rPr>
+          <w:b/>
+        </w:rPr>
+        <w:t>Supporting Roles of Inductive and Analogical Reasoning</w:t>
       </w:r>
     </w:p>
     <w:p>
@@ -273,7 +323,7 @@
         <w:rPr>
           <w:b w:val="0"/>
         </w:rPr>
-        <w:t>If a doctor diagnoses diabetes, the next step is often thinking about what happens if the condition is treated versus what happens if it is ignored. The diagnosis becomes meaningful because it helps guide decisions and reduce future risk.</w:t>
+        <w:t>Abduction, deduction, and prediction carry most of the diagnostic load, but two other forms of reasoning run alongside them. Inductive reasoning builds a general conclusion out of many specific observations (Cleveland Clinic, 2024). A physician who has treated hundreds of influenza cases recognizes the pattern quickly and infers that a new patient with the same cluster of symptoms probably has it too. The conclusion is likely rather than certain, which is what separates induction from deduction.</w:t>
       </w:r>
     </w:p>
     <w:p>
@@ -285,7 +335,7 @@
         <w:rPr>
           <w:b w:val="0"/>
         </w:rPr>
-        <w:t>I rely on the same type of thinking in my own work. If I find a slow water leak behind a wall, the leak itself may not be a major problem today. However, predicting the long-term consequences such as water damage, mold growth, or structural issues is what determines how urgently the repair needs to happen. In both medicine and facilities management, predictive reasoning helps determine priorities and drives action.</w:t>
+        <w:t>Analogical reasoning works by comparison, using the similarities between two cases to suggest that they share a cause. Bartha (2019) characterizes analogical arguments as reasoning from accepted similarities between two systems toward a further similarity. A doctor who notices that a patient's presentation closely resembles an earlier case is reasoning by analogy; the cases are not identical, but the resemblance guides the next step. This is close to how I lean on past jobs, where a failure that looks like one I fixed before points me toward the same diagnosis. Both forms speed up recognition, but in this scenario they feed the three primary types rather than replace them.</w:t>
       </w:r>
     </w:p>
     <w:p>
@@ -308,7 +358,7 @@
         <w:rPr>
           <w:b w:val="0"/>
         </w:rPr>
-        <w:t>Looking at diagnosis through the lens of reasoning made the process feel much less mysterious than I expected. The same basic approach that a physician uses to diagnose a patient is surprisingly similar to the process I use when troubleshooting equipment and building systems.</w:t>
+        <w:t>A diagnosis is not one insight but a sequence of connected judgments. Abductive reasoning produces the most likely explanation for a patient's symptoms, deductive reasoning tests that explanation against evidence that can be checked, and predictive reasoning looks ahead to outcomes and treatment. Inductive and analogical reasoning support the process by supplying the patterns and past cases the physician draws on. The physician doesn't use one type of reasoning and stop there. As new information comes in, the process keeps looping between possible explanations, testing, and predicting what happens next.</w:t>
       </w:r>
     </w:p>
     <w:p>
@@ -320,19 +370,7 @@
         <w:rPr>
           <w:b w:val="0"/>
         </w:rPr>
-        <w:t>Abductive reasoning helps generate the most likely explanation for a set of symptoms. Deductive reasoning helps determine whether that explanation is supported by evidence. Predictive reasoning helps evaluate what is likely to happen next and what actions should be taken. Together, these forms of reasoning create a practical framework for making decisions in situations where the answer is not immediately obvious.</w:t>
-      </w:r>
-    </w:p>
-    <w:p>
-      <w:pPr>
-        <w:ind w:firstLine="720"/>
-        <w:jc w:val="left"/>
-      </w:pPr>
-      <w:r>
-        <w:rPr>
-          <w:b w:val="0"/>
-        </w:rPr>
-        <w:t>The biggest takeaway for me was realizing that I have been using these reasoning patterns for years without thinking about them in formal terms. This assignment gave me a vocabulary for a process that already felt familiar. It also helped me see why these same reasoning methods are so important in artificial intelligence systems that attempt to support medical diagnosis and other types of complex decision-making.</w:t>
+        <w:t>Looking at the doctor's work through a technician's lens showed me that I have been running this same loop for years without naming its parts. It also frames the rest of this course for me. The AI systems now being built to assist with diagnosis are attempts to automate exactly this reasoning cycle, and understanding how people reason abductively, deductively, and predictively is the starting point for judging how well a machine can do the same.</w:t>
       </w:r>
     </w:p>
     <w:p>
@@ -372,6 +410,52 @@
           <w:i w:val="0"/>
         </w:rPr>
         <w:t>(6), 508–509. https://pmc.ncbi.nlm.nih.gov/articles/PMC2801944/</w:t>
+      </w:r>
+    </w:p>
+    <w:p>
+      <w:pPr>
+        <w:ind w:left="720" w:hanging="720"/>
+      </w:pPr>
+      <w:r>
+        <w:rPr>
+          <w:i w:val="0"/>
+        </w:rPr>
+        <w:t xml:space="preserve">Bartha, P. (2019). Analogy and analogical reasoning. In E. N. Zalta (Ed.), </w:t>
+      </w:r>
+      <w:r>
+        <w:rPr>
+          <w:i/>
+        </w:rPr>
+        <w:t>The Stanford encyclopedia of philosophy</w:t>
+      </w:r>
+      <w:r>
+        <w:rPr>
+          <w:i w:val="0"/>
+        </w:rPr>
+        <w:t xml:space="preserve"> (Spring 2019 ed.). Metaphysics Research Lab, Stanford University. https://plato.stanford.edu/entries/reasoning-analogy/</w:t>
+      </w:r>
+    </w:p>
+    <w:p>
+      <w:pPr>
+        <w:ind w:left="720" w:hanging="720"/>
+      </w:pPr>
+      <w:r>
+        <w:rPr>
+          <w:i w:val="0"/>
+        </w:rPr>
+        <w:t xml:space="preserve">Cleveland Clinic. (2024). </w:t>
+      </w:r>
+      <w:r>
+        <w:rPr>
+          <w:i/>
+        </w:rPr>
+        <w:t>Inductive vs. deductive reasoning: The difference and how they affect your well-being.</w:t>
+      </w:r>
+      <w:r>
+        <w:rPr>
+          <w:i w:val="0"/>
+        </w:rPr>
+        <w:t xml:space="preserve"> Cleveland Clinic Health Essentials. https://health.clevelandclinic.org/inductive-vs-deductive-reasoning</w:t>
       </w:r>
     </w:p>
     <w:p>

</xml_diff>

<commit_message>
Soften deductive pneumonia example (drop infiltrates/X-ray specifics)
</commit_message>
<xml_diff>
--- a/Week 3/ALY3510_MatthewNaughton_Week3_Fall_2026.docx
+++ b/Week 3/ALY3510_MatthewNaughton_Week3_Fall_2026.docx
@@ -202,7 +202,7 @@
         <w:rPr>
           <w:b w:val="0"/>
         </w:rPr>
-        <w:t>A physician uses deduction to spell out what should be true if a hypothesis is correct, then checks for it. If the working diagnosis is bacterial pneumonia, specific findings should appear on imaging, in lab work, or on physical examination. The reasoning takes a familiar form:</w:t>
+        <w:t>A physician uses deduction to spell out what should be true if a hypothesis is correct, then checks for it. If the working diagnosis is pneumonia, characteristic findings should appear on imaging, in lab work, or on physical examination. The reasoning takes a familiar form:</w:t>
       </w:r>
     </w:p>
     <w:p>
@@ -215,7 +215,7 @@
           <w:rFonts w:ascii="Times New Roman" w:hAnsi="Times New Roman"/>
           <w:sz w:val="24"/>
         </w:rPr>
-        <w:t>Patients with bacterial pneumonia usually show infiltrates on a chest X-ray.</w:t>
+        <w:t>A diagnosis like pneumonia should produce characteristic findings on chest imaging.</w:t>
       </w:r>
     </w:p>
     <w:p>
@@ -228,7 +228,7 @@
           <w:rFonts w:ascii="Times New Roman" w:hAnsi="Times New Roman"/>
           <w:sz w:val="24"/>
         </w:rPr>
-        <w:t>This patient may have bacterial pneumonia.</w:t>
+        <w:t>This patient may have pneumonia.</w:t>
       </w:r>
     </w:p>
     <w:p>
@@ -241,7 +241,7 @@
           <w:rFonts w:ascii="Times New Roman" w:hAnsi="Times New Roman"/>
           <w:sz w:val="24"/>
         </w:rPr>
-        <w:t>A chest X-ray should therefore show infiltrates.</w:t>
+        <w:t>Chest imaging should therefore show those findings.</w:t>
       </w:r>
     </w:p>
     <w:p>
@@ -253,7 +253,7 @@
         <w:rPr>
           <w:b w:val="0"/>
         </w:rPr>
-        <w:t>If the film is clear, the premise fails and the hypothesis is in trouble, which sends the physician back to the list of explanations. I run the same kind of check before I trust a repair. I work from rules I know hold for a system: if I close an isolation valve, downstream pressure should drop to zero. I close the valve, watch the gauge, and the result either confirms my theory or rules it out. Ordering a test and closing a valve are the same act of reasoning: deriving a specific, checkable consequence from a general rule and letting the result decide.</w:t>
+        <w:t>If the imaging does not show them, the premise fails and the hypothesis is in trouble, which sends the physician back to the list of explanations. I run the same kind of check before I trust a repair. I work from rules I know hold for a system: if I close an isolation valve, downstream pressure should drop to zero. I close the valve, watch the gauge, and the result either confirms my theory or rules it out. Ordering a test and closing a valve are the same act of reasoning: deriving a specific, checkable consequence from a general rule and letting the result decide.</w:t>
       </w:r>
     </w:p>
     <w:p>

</xml_diff>